<commit_message>
Add supplement.md support to reports; add supplement for Instagram CLAUDE.md reel
Co-Authored-By: Claude Sonnet 5.5 <noreply@anthropic.com>
Claude-Session: https://claude.ai/code/session_018V6Fu5BPSFZCUm4855xFzi
</commit_message>
<xml_diff>
--- a/watch-output/2026-10-11_Instagram_Claude-額度省用法-CLAUDE-md-模型分工__DeUPXT1s44U/2026-10-11_Instagram_Claude-額度省用法-CLAUDE__DeUPXT1s44U_report.docx
+++ b/watch-output/2026-10-11_Instagram_Claude-額度省用法-CLAUDE-md-模型分工__DeUPXT1s44U/2026-10-11_Instagram_Claude-額度省用法-CLAUDE__DeUPXT1s44U_report.docx
@@ -497,7 +497,7 @@
           <w:rFonts w:ascii="Microsoft JhengHei" w:hAnsi="Microsoft JhengHei" w:eastAsia="Microsoft JhengHei"/>
           <w:sz w:val="21"/>
         </w:rPr>
-        <w:t>「最強的模型」講者未點名；畫面 CLAUDE.md 範例出現「Fable」，推測即指它，僅供參考。</w:t>
+        <w:t>「最強的模型」講者未點名；經〈補充資料〉（貼文提供的完整 CLAUDE.md）確認指 Fable 5.1。</w:t>
       </w:r>
     </w:p>
     <w:p>
@@ -536,7 +536,364 @@
           <w:rFonts w:ascii="Microsoft JhengHei" w:hAnsi="Microsoft JhengHei" w:eastAsia="Microsoft JhengHei"/>
           <w:sz w:val="21"/>
         </w:rPr>
-        <w:t>影片為口播＋圖示，內容短（42 秒）；完整指令需留言向講者索取，影片中未揭露。</w:t>
+        <w:t>影片為口播＋圖示，內容短（42 秒）；完整 CLAUDE.md 影片中未揭露，已由使用者提供並收錄於〈補充資料〉（</w:t>
+      </w:r>
+      <w:r>
+        <w:rPr>
+          <w:rFonts w:ascii="Consolas" w:hAnsi="Consolas" w:eastAsia="Microsoft JhengHei"/>
+          <w:sz w:val="19"/>
+        </w:rPr>
+        <w:t>supplement.md</w:t>
+      </w:r>
+      <w:r>
+        <w:rPr>
+          <w:rFonts w:ascii="Microsoft JhengHei" w:hAnsi="Microsoft JhengHei" w:eastAsia="Microsoft JhengHei"/>
+          <w:sz w:val="21"/>
+        </w:rPr>
+        <w:t>）。</w:t>
+      </w:r>
+    </w:p>
+    <w:p>
+      <w:pPr>
+        <w:pStyle w:val="Heading2"/>
+      </w:pPr>
+      <w:r>
+        <w:t>補充資料（影片未呈現的資訊）</w:t>
+      </w:r>
+    </w:p>
+    <w:p>
+      <w:pPr>
+        <w:pStyle w:val="ListBullet"/>
+      </w:pPr>
+      <w:r>
+        <w:rPr>
+          <w:rFonts w:ascii="Microsoft JhengHei" w:hAnsi="Microsoft JhengHei" w:eastAsia="Microsoft JhengHei"/>
+          <w:b/>
+          <w:sz w:val="21"/>
+        </w:rPr>
+        <w:t>來源：</w:t>
+      </w:r>
+      <w:r>
+        <w:rPr>
+          <w:rFonts w:ascii="Microsoft JhengHei" w:hAnsi="Microsoft JhengHei" w:eastAsia="Microsoft JhengHei"/>
+          <w:sz w:val="21"/>
+        </w:rPr>
+        <w:t xml:space="preserve"> 使用者提供的貼文文字（影片留言「省錢」後講者回傳的內容，開頭為「這是影片提到的CLAUDE.md👇」）。</w:t>
+      </w:r>
+    </w:p>
+    <w:p>
+      <w:pPr>
+        <w:pStyle w:val="ListBullet"/>
+      </w:pPr>
+      <w:r>
+        <w:rPr>
+          <w:rFonts w:ascii="Microsoft JhengHei" w:hAnsi="Microsoft JhengHei" w:eastAsia="Microsoft JhengHei"/>
+          <w:b/>
+          <w:sz w:val="21"/>
+        </w:rPr>
+        <w:t>為何需要補充：</w:t>
+      </w:r>
+      <w:r>
+        <w:rPr>
+          <w:rFonts w:ascii="Microsoft JhengHei" w:hAnsi="Microsoft JhengHei" w:eastAsia="Microsoft JhengHei"/>
+          <w:sz w:val="21"/>
+        </w:rPr>
+        <w:t xml:space="preserve"> 影片 00:12–00:23 的畫面只短暫露出 CLAUDE.md 的前兩行，完整指令講者要求觀眾留言索取，影片本身沒有揭露。</w:t>
+      </w:r>
+    </w:p>
+    <w:p>
+      <w:pPr>
+        <w:pStyle w:val="Heading3"/>
+      </w:pPr>
+      <w:r>
+        <w:t>影片提到的 CLAUDE.md</w:t>
+      </w:r>
+    </w:p>
+    <w:p>
+      <w:pPr>
+        <w:spacing w:after="0"/>
+        <w:ind w:left="454"/>
+      </w:pPr>
+      <w:r>
+        <w:rPr>
+          <w:rFonts w:ascii="Consolas" w:hAnsi="Consolas" w:eastAsia="Microsoft JhengHei"/>
+          <w:sz w:val="20"/>
+        </w:rPr>
+        <w:t>永遠不要自己執行任務，一律交給 sub-agent 處理。</w:t>
+      </w:r>
+    </w:p>
+    <w:p>
+      <w:pPr>
+        <w:spacing w:after="0"/>
+        <w:ind w:left="454"/>
+      </w:pPr>
+      <w:r>
+        <w:rPr>
+          <w:rFonts w:ascii="Consolas" w:hAnsi="Consolas" w:eastAsia="Microsoft JhengHei"/>
+          <w:sz w:val="20"/>
+        </w:rPr>
+      </w:r>
+    </w:p>
+    <w:p>
+      <w:pPr>
+        <w:spacing w:after="0"/>
+        <w:ind w:left="454"/>
+      </w:pPr>
+      <w:r>
+        <w:rPr>
+          <w:rFonts w:ascii="Consolas" w:hAnsi="Consolas" w:eastAsia="Microsoft JhengHei"/>
+          <w:sz w:val="20"/>
+        </w:rPr>
+        <w:t>不要所有任務都使用 Fable。較簡單的任務請使用 Opus 5.5。</w:t>
+      </w:r>
+    </w:p>
+    <w:p>
+      <w:pPr>
+        <w:spacing w:after="0"/>
+        <w:ind w:left="454"/>
+      </w:pPr>
+      <w:r>
+        <w:rPr>
+          <w:rFonts w:ascii="Consolas" w:hAnsi="Consolas" w:eastAsia="Microsoft JhengHei"/>
+          <w:sz w:val="20"/>
+        </w:rPr>
+      </w:r>
+    </w:p>
+    <w:p>
+      <w:pPr>
+        <w:spacing w:after="0"/>
+        <w:ind w:left="454"/>
+      </w:pPr>
+      <w:r>
+        <w:rPr>
+          <w:rFonts w:ascii="Consolas" w:hAnsi="Consolas" w:eastAsia="Microsoft JhengHei"/>
+          <w:sz w:val="20"/>
+        </w:rPr>
+        <w:t># 模型路由</w:t>
+      </w:r>
+    </w:p>
+    <w:p>
+      <w:pPr>
+        <w:spacing w:after="0"/>
+        <w:ind w:left="454"/>
+      </w:pPr>
+      <w:r>
+        <w:rPr>
+          <w:rFonts w:ascii="Consolas" w:hAnsi="Consolas" w:eastAsia="Microsoft JhengHei"/>
+          <w:sz w:val="20"/>
+        </w:rPr>
+        <w:t>- **Fable 5.1**：系統架構、困難的 Bug、程式碼審查</w:t>
+      </w:r>
+    </w:p>
+    <w:p>
+      <w:pPr>
+        <w:spacing w:after="0"/>
+        <w:ind w:left="454"/>
+      </w:pPr>
+      <w:r>
+        <w:rPr>
+          <w:rFonts w:ascii="Consolas" w:hAnsi="Consolas" w:eastAsia="Microsoft JhengHei"/>
+          <w:sz w:val="20"/>
+        </w:rPr>
+        <w:t>- **Opus 5.5**：修改、測試、文件、重構</w:t>
+      </w:r>
+    </w:p>
+    <w:p>
+      <w:pPr>
+        <w:spacing w:after="0"/>
+        <w:ind w:left="454"/>
+      </w:pPr>
+      <w:r>
+        <w:rPr>
+          <w:rFonts w:ascii="Consolas" w:hAnsi="Consolas" w:eastAsia="Microsoft JhengHei"/>
+          <w:sz w:val="20"/>
+        </w:rPr>
+        <w:t>- **Haiku 4.5**：資料查詢與摘要</w:t>
+      </w:r>
+    </w:p>
+    <w:p>
+      <w:pPr>
+        <w:spacing w:after="0"/>
+        <w:ind w:left="454"/>
+      </w:pPr>
+      <w:r>
+        <w:rPr>
+          <w:rFonts w:ascii="Consolas" w:hAnsi="Consolas" w:eastAsia="Microsoft JhengHei"/>
+          <w:sz w:val="20"/>
+        </w:rPr>
+        <w:t>- 每次呼叫 Agent 時，都必須指定 `model`</w:t>
+      </w:r>
+    </w:p>
+    <w:p>
+      <w:pPr>
+        <w:spacing w:after="0"/>
+        <w:ind w:left="454"/>
+      </w:pPr>
+      <w:r>
+        <w:rPr>
+          <w:rFonts w:ascii="Consolas" w:hAnsi="Consolas" w:eastAsia="Microsoft JhengHei"/>
+          <w:sz w:val="20"/>
+        </w:rPr>
+      </w:r>
+    </w:p>
+    <w:p>
+      <w:pPr>
+        <w:spacing w:after="0"/>
+        <w:ind w:left="454"/>
+      </w:pPr>
+      <w:r>
+        <w:rPr>
+          <w:rFonts w:ascii="Consolas" w:hAnsi="Consolas" w:eastAsia="Microsoft JhengHei"/>
+          <w:sz w:val="20"/>
+        </w:rPr>
+        <w:t># 任務委派</w:t>
+      </w:r>
+    </w:p>
+    <w:p>
+      <w:pPr>
+        <w:spacing w:after="0"/>
+        <w:ind w:left="454"/>
+      </w:pPr>
+      <w:r>
+        <w:rPr>
+          <w:rFonts w:ascii="Consolas" w:hAnsi="Consolas" w:eastAsia="Microsoft JhengHei"/>
+          <w:sz w:val="20"/>
+        </w:rPr>
+        <w:t>- 每個任務交給一個 sub-agent，執行前先規劃</w:t>
+      </w:r>
+    </w:p>
+    <w:p>
+      <w:pPr>
+        <w:spacing w:after="0"/>
+        <w:ind w:left="454"/>
+      </w:pPr>
+      <w:r>
+        <w:rPr>
+          <w:rFonts w:ascii="Consolas" w:hAnsi="Consolas" w:eastAsia="Microsoft JhengHei"/>
+          <w:sz w:val="20"/>
+        </w:rPr>
+        <w:t>- 彼此獨立的 sub-agent 任務要平行執行</w:t>
+      </w:r>
+    </w:p>
+    <w:p>
+      <w:pPr>
+        <w:spacing w:after="0"/>
+        <w:ind w:left="454"/>
+      </w:pPr>
+      <w:r>
+        <w:rPr>
+          <w:rFonts w:ascii="Consolas" w:hAnsi="Consolas" w:eastAsia="Microsoft JhengHei"/>
+          <w:sz w:val="20"/>
+        </w:rPr>
+        <w:t>- 只閱讀 sub-agent 的報告，不要直接讀取檔案</w:t>
+      </w:r>
+    </w:p>
+    <w:p>
+      <w:pPr>
+        <w:pStyle w:val="Heading3"/>
+      </w:pPr>
+      <w:r>
+        <w:t>與影片對照</w:t>
+      </w:r>
+    </w:p>
+    <w:p>
+      <w:pPr>
+        <w:pStyle w:val="ListBullet"/>
+      </w:pPr>
+      <w:r>
+        <w:rPr>
+          <w:rFonts w:ascii="Microsoft JhengHei" w:hAnsi="Microsoft JhengHei" w:eastAsia="Microsoft JhengHei"/>
+          <w:sz w:val="21"/>
+        </w:rPr>
+        <w:t>畫面（約 00:14）只顯示前兩行：「永遠不要自己執行任務，一律交給 Sub agent 處理」與「不要所有任務都使用 Fable，簡單…」，與補充內容一致，其餘為補充。</w:t>
+      </w:r>
+    </w:p>
+    <w:p>
+      <w:pPr>
+        <w:pStyle w:val="ListBullet"/>
+      </w:pPr>
+      <w:r>
+        <w:rPr>
+          <w:rFonts w:ascii="Microsoft JhengHei" w:hAnsi="Microsoft JhengHei" w:eastAsia="Microsoft JhengHei"/>
+          <w:sz w:val="21"/>
+        </w:rPr>
+        <w:t xml:space="preserve">講者口述的「最強的模型」＝ </w:t>
+      </w:r>
+      <w:r>
+        <w:rPr>
+          <w:rFonts w:ascii="Microsoft JhengHei" w:hAnsi="Microsoft JhengHei" w:eastAsia="Microsoft JhengHei"/>
+          <w:b/>
+          <w:sz w:val="21"/>
+        </w:rPr>
+        <w:t>Fable</w:t>
+      </w:r>
+      <w:r>
+        <w:rPr>
+          <w:rFonts w:ascii="Microsoft JhengHei" w:hAnsi="Microsoft JhengHei" w:eastAsia="Microsoft JhengHei"/>
+          <w:sz w:val="21"/>
+        </w:rPr>
+        <w:t>（補充內容的模型路由寫明 Fable 5.1 負責系統架構、困難 Bug、程式碼審查）；「比較簡單的工作」＝ Opus 5.5（修改、測試、文件、重構），資料查詢與摘要則用 Haiku 4.5。</w:t>
+      </w:r>
+    </w:p>
+    <w:p>
+      <w:pPr>
+        <w:pStyle w:val="ListBullet"/>
+      </w:pPr>
+      <w:r>
+        <w:rPr>
+          <w:rFonts w:ascii="Microsoft JhengHei" w:hAnsi="Microsoft JhengHei" w:eastAsia="Microsoft JhengHei"/>
+          <w:sz w:val="21"/>
+        </w:rPr>
+        <w:t xml:space="preserve">補充內容比口述多出三個做法：每次呼叫 Agent 都必須指定 </w:t>
+      </w:r>
+      <w:r>
+        <w:rPr>
+          <w:rFonts w:ascii="Consolas" w:hAnsi="Consolas" w:eastAsia="Microsoft JhengHei"/>
+          <w:sz w:val="19"/>
+        </w:rPr>
+        <w:t>model</w:t>
+      </w:r>
+      <w:r>
+        <w:rPr>
+          <w:rFonts w:ascii="Microsoft JhengHei" w:hAnsi="Microsoft JhengHei" w:eastAsia="Microsoft JhengHei"/>
+          <w:sz w:val="21"/>
+        </w:rPr>
+        <w:t>、彼此獨立的任務平行執行、只讀 sub-agent 的報告而不直接讀檔。</w:t>
+      </w:r>
+    </w:p>
+    <w:p>
+      <w:pPr>
+        <w:pStyle w:val="Heading3"/>
+      </w:pPr>
+      <w:r>
+        <w:t>備註</w:t>
+      </w:r>
+    </w:p>
+    <w:p>
+      <w:pPr>
+        <w:pStyle w:val="ListBullet"/>
+      </w:pPr>
+      <w:r>
+        <w:rPr>
+          <w:rFonts w:ascii="Microsoft JhengHei" w:hAnsi="Microsoft JhengHei" w:eastAsia="Microsoft JhengHei"/>
+          <w:sz w:val="21"/>
+        </w:rPr>
+        <w:t>以上文字為貼文所述，逐字保留；模型分工與其省成本效果是講者的範例與主張，</w:t>
+      </w:r>
+      <w:r>
+        <w:rPr>
+          <w:rFonts w:ascii="Microsoft JhengHei" w:hAnsi="Microsoft JhengHei" w:eastAsia="Microsoft JhengHei"/>
+          <w:b/>
+          <w:sz w:val="21"/>
+        </w:rPr>
+        <w:t>未經查證</w:t>
+      </w:r>
+      <w:r>
+        <w:rPr>
+          <w:rFonts w:ascii="Microsoft JhengHei" w:hAnsi="Microsoft JhengHei" w:eastAsia="Microsoft JhengHei"/>
+          <w:sz w:val="21"/>
+        </w:rPr>
+        <w:t>，是否適用請依自己的專案評估。</w:t>
       </w:r>
     </w:p>
     <w:p>
@@ -788,7 +1145,7 @@
           <w:rFonts w:ascii="Microsoft JhengHei" w:hAnsi="Microsoft JhengHei" w:eastAsia="Microsoft JhengHei"/>
           <w:sz w:val="21"/>
         </w:rPr>
-        <w:t xml:space="preserve"> 複雜任務才交給最強模型、簡單工作用 Opus 5.5；適合拆開的任務交給不同 Sub Agent。畫面範例：「永遠不要自己執行任務，一律交給 Sub agent 處理」「不要所有任務都使用 Fable，簡單…」。</w:t>
+        <w:t xml:space="preserve"> 複雜任務才交給最強模型（Fable）、簡單工作用 Opus 5.5；適合拆開的任務交給不同 Sub Agent。畫面只露出 CLAUDE.md 前兩行，完整內容見〈補充資料〉。</w:t>
       </w:r>
     </w:p>
     <w:p>
@@ -1180,53 +1537,6 @@
                 <w:rFonts w:ascii="Microsoft JhengHei" w:hAnsi="Microsoft JhengHei" w:eastAsia="Microsoft JhengHei"/>
                 <w:sz w:val="19"/>
               </w:rPr>
-              <w:t>00:14</w:t>
-            </w:r>
-          </w:p>
-        </w:tc>
-        <w:tc>
-          <w:tcPr>
-            <w:tcW w:type="dxa" w:w="3324"/>
-          </w:tcPr>
-          <w:p>
-            <w:r/>
-            <w:r>
-              <w:rPr>
-                <w:rFonts w:ascii="Microsoft JhengHei" w:hAnsi="Microsoft JhengHei" w:eastAsia="Microsoft JhengHei"/>
-                <w:sz w:val="19"/>
-              </w:rPr>
-              <w:t>複雜的任務才交給最強的模型</w:t>
-            </w:r>
-          </w:p>
-        </w:tc>
-        <w:tc>
-          <w:tcPr>
-            <w:tcW w:type="dxa" w:w="3324"/>
-          </w:tcPr>
-          <w:p>
-            <w:r/>
-            <w:r>
-              <w:rPr>
-                <w:rFonts w:ascii="Microsoft JhengHei" w:hAnsi="Microsoft JhengHei" w:eastAsia="Microsoft JhengHei"/>
-                <w:sz w:val="19"/>
-              </w:rPr>
-              <w:t>講者未點名模型；畫面 CLAUDE.md 範例寫「不要所有任務都使用Fable」，最強模型推測指 Fable</w:t>
-            </w:r>
-          </w:p>
-        </w:tc>
-      </w:tr>
-      <w:tr>
-        <w:tc>
-          <w:tcPr>
-            <w:tcW w:type="dxa" w:w="3324"/>
-          </w:tcPr>
-          <w:p>
-            <w:r/>
-            <w:r>
-              <w:rPr>
-                <w:rFonts w:ascii="Microsoft JhengHei" w:hAnsi="Microsoft JhengHei" w:eastAsia="Microsoft JhengHei"/>
-                <w:sz w:val="19"/>
-              </w:rPr>
               <w:t>00:29</w:t>
             </w:r>
           </w:p>
@@ -1258,6 +1568,53 @@
                 <w:sz w:val="19"/>
               </w:rPr>
               <w:t>講者口述「快一半」；畫面圖示標 -40% 與 +30%，兩者略有出入（數字皆為講者主張，未查證）</w:t>
+            </w:r>
+          </w:p>
+        </w:tc>
+      </w:tr>
+      <w:tr>
+        <w:tc>
+          <w:tcPr>
+            <w:tcW w:type="dxa" w:w="3324"/>
+          </w:tcPr>
+          <w:p>
+            <w:r/>
+            <w:r>
+              <w:rPr>
+                <w:rFonts w:ascii="Microsoft JhengHei" w:hAnsi="Microsoft JhengHei" w:eastAsia="Microsoft JhengHei"/>
+                <w:sz w:val="19"/>
+              </w:rPr>
+              <w:t>00:14</w:t>
+            </w:r>
+          </w:p>
+        </w:tc>
+        <w:tc>
+          <w:tcPr>
+            <w:tcW w:type="dxa" w:w="3324"/>
+          </w:tcPr>
+          <w:p>
+            <w:r/>
+            <w:r>
+              <w:rPr>
+                <w:rFonts w:ascii="Microsoft JhengHei" w:hAnsi="Microsoft JhengHei" w:eastAsia="Microsoft JhengHei"/>
+                <w:sz w:val="19"/>
+              </w:rPr>
+              <w:t>複雜的任務才交給最強的模型</w:t>
+            </w:r>
+          </w:p>
+        </w:tc>
+        <w:tc>
+          <w:tcPr>
+            <w:tcW w:type="dxa" w:w="3324"/>
+          </w:tcPr>
+          <w:p>
+            <w:r/>
+            <w:r>
+              <w:rPr>
+                <w:rFonts w:ascii="Microsoft JhengHei" w:hAnsi="Microsoft JhengHei" w:eastAsia="Microsoft JhengHei"/>
+                <w:sz w:val="19"/>
+              </w:rPr>
+              <w:t>講者未點名；已由 supplement.md 確認指 Fable（Fable 5.1）</w:t>
             </w:r>
           </w:p>
         </w:tc>

</xml_diff>

<commit_message>
Report: add supplement.md reference at the end when a supplement exists
Co-Authored-By: Claude Sonnet 5.5 <noreply@anthropic.com>
Claude-Session: https://claude.ai/code/session_018V6Fu5BPSFZCUm4855xFzi
</commit_message>
<xml_diff>
--- a/watch-output/2026-10-11_Instagram_Claude-額度省用法-CLAUDE-md-模型分工__DeUPXT1s44U/2026-10-11_Instagram_Claude-額度省用法-CLAUDE__DeUPXT1s44U_report.docx
+++ b/watch-output/2026-10-11_Instagram_Claude-額度省用法-CLAUDE-md-模型分工__DeUPXT1s44U/2026-10-11_Instagram_Claude-額度省用法-CLAUDE__DeUPXT1s44U_report.docx
@@ -1621,6 +1621,40 @@
       </w:tr>
     </w:tbl>
     <w:p/>
+    <w:p>
+      <w:pPr>
+        <w:pStyle w:val="Heading2"/>
+      </w:pPr>
+      <w:r>
+        <w:t>補充資料連結</w:t>
+      </w:r>
+    </w:p>
+    <w:p>
+      <w:pPr>
+        <w:pStyle w:val="ListBullet"/>
+      </w:pPr>
+      <w:r>
+        <w:rPr>
+          <w:rFonts w:ascii="Microsoft JhengHei" w:hAnsi="Microsoft JhengHei" w:eastAsia="Microsoft JhengHei"/>
+          <w:sz w:val="21"/>
+        </w:rPr>
+        <w:t>補充資料檔：</w:t>
+      </w:r>
+      <w:r>
+        <w:rPr>
+          <w:rFonts w:ascii="Consolas" w:hAnsi="Consolas" w:eastAsia="Microsoft JhengHei"/>
+          <w:sz w:val="21"/>
+        </w:rPr>
+        <w:t>supplement.md</w:t>
+      </w:r>
+      <w:r>
+        <w:rPr>
+          <w:rFonts w:ascii="Microsoft JhengHei" w:hAnsi="Microsoft JhengHei" w:eastAsia="Microsoft JhengHei"/>
+          <w:sz w:val="21"/>
+        </w:rPr>
+        <w:t>（與本報告同資料夾；內容已收錄於上方〈補充資料〉）</w:t>
+      </w:r>
+    </w:p>
     <w:sectPr>
       <w:pgSz w:w="12240" w:h="15840"/>
       <w:pgMar w:top="1440" w:right="1134" w:bottom="1440" w:left="1134" w:header="720" w:footer="720" w:gutter="0"/>

</xml_diff>

<commit_message>
supplement.md: template with S-items, verbatim/analysis split and wording levels; harden build_report supplement parsing
Co-Authored-By: Claude Sonnet 5.5 <noreply@anthropic.com>
Claude-Session: https://claude.ai/code/session_018V6Fu5BPSFZCUm4855xFzi
</commit_message>
<xml_diff>
--- a/watch-output/2026-10-11_Instagram_Claude-額度省用法-CLAUDE-md-模型分工__DeUPXT1s44U/2026-10-11_Instagram_Claude-額度省用法-CLAUDE__DeUPXT1s44U_report.docx
+++ b/watch-output/2026-10-11_Instagram_Claude-額度省用法-CLAUDE-md-模型分工__DeUPXT1s44U/2026-10-11_Instagram_Claude-額度省用法-CLAUDE__DeUPXT1s44U_report.docx
@@ -497,7 +497,7 @@
           <w:rFonts w:ascii="Microsoft JhengHei" w:hAnsi="Microsoft JhengHei" w:eastAsia="Microsoft JhengHei"/>
           <w:sz w:val="21"/>
         </w:rPr>
-        <w:t>「最強的模型」講者未點名；經〈補充資料〉（貼文提供的完整 CLAUDE.md）確認指 Fable 5.1。</w:t>
+        <w:t>「最強的模型」講者未點名；據〈補充資料〉S1（貼文提供的完整 CLAUDE.md）推定指 Fable 5.1（非補充直接寫明）。</w:t>
       </w:r>
     </w:p>
     <w:p>
@@ -563,22 +563,10 @@
     </w:p>
     <w:p>
       <w:pPr>
-        <w:pStyle w:val="ListBullet"/>
+        <w:pStyle w:val="Heading3"/>
       </w:pPr>
       <w:r>
-        <w:rPr>
-          <w:rFonts w:ascii="Microsoft JhengHei" w:hAnsi="Microsoft JhengHei" w:eastAsia="Microsoft JhengHei"/>
-          <w:b/>
-          <w:sz w:val="21"/>
-        </w:rPr>
-        <w:t>來源：</w:t>
-      </w:r>
-      <w:r>
-        <w:rPr>
-          <w:rFonts w:ascii="Microsoft JhengHei" w:hAnsi="Microsoft JhengHei" w:eastAsia="Microsoft JhengHei"/>
-          <w:sz w:val="21"/>
-        </w:rPr>
-        <w:t xml:space="preserve"> 使用者提供的貼文文字（影片留言「省錢」後講者回傳的內容，開頭為「這是影片提到的CLAUDE.md👇」）。</w:t>
+        <w:t>S1｜留言（推測）：影片提到的完整 CLAUDE.md</w:t>
       </w:r>
     </w:p>
     <w:p>
@@ -588,25 +576,45 @@
       <w:r>
         <w:rPr>
           <w:rFonts w:ascii="Microsoft JhengHei" w:hAnsi="Microsoft JhengHei" w:eastAsia="Microsoft JhengHei"/>
-          <w:b/>
           <w:sz w:val="21"/>
         </w:rPr>
-        <w:t>為何需要補充：</w:t>
+        <w:t>來源：使用者貼上的文字，使用者表示為講者回覆「省錢」留言後傳送的內容（開頭為「這是影片提到的CLAUDE.md👇」；原始位置未經確認）；取得日期：2026-10-11；取得方式：使用者貼上。</w:t>
+      </w:r>
+    </w:p>
+    <w:p>
+      <w:pPr>
+        <w:pStyle w:val="ListBullet"/>
+      </w:pPr>
+      <w:r>
+        <w:rPr>
+          <w:rFonts w:ascii="Microsoft JhengHei" w:hAnsi="Microsoft JhengHei" w:eastAsia="Microsoft JhengHei"/>
+          <w:sz w:val="21"/>
+        </w:rPr>
+        <w:t xml:space="preserve">為何需要補充：影片只在 </w:t>
+      </w:r>
+      <w:r>
+        <w:rPr>
+          <w:rFonts w:ascii="Consolas" w:hAnsi="Consolas" w:eastAsia="Microsoft JhengHei"/>
+          <w:sz w:val="19"/>
+        </w:rPr>
+        <w:t>frame_0007.jpg</w:t>
       </w:r>
       <w:r>
         <w:rPr>
           <w:rFonts w:ascii="Microsoft JhengHei" w:hAnsi="Microsoft JhengHei" w:eastAsia="Microsoft JhengHei"/>
           <w:sz w:val="21"/>
         </w:rPr>
-        <w:t xml:space="preserve"> 影片 00:12–00:23 的畫面只短暫露出 CLAUDE.md 的前兩行，完整指令講者要求觀眾留言索取，影片本身沒有揭露。</w:t>
+        <w:t>（00:14）短暫露出 CLAUDE.md 的前兩行；完整內容講者要求觀眾留言索取（00:38–00:40），影片本身沒有揭露。</w:t>
       </w:r>
     </w:p>
     <w:p>
-      <w:pPr>
-        <w:pStyle w:val="Heading3"/>
-      </w:pPr>
       <w:r>
-        <w:t>影片提到的 CLAUDE.md</w:t>
+        <w:rPr>
+          <w:rFonts w:ascii="Microsoft JhengHei" w:hAnsi="Microsoft JhengHei" w:eastAsia="Microsoft JhengHei"/>
+          <w:b/>
+          <w:sz w:val="21"/>
+        </w:rPr>
+        <w:t>原文（逐字）</w:t>
       </w:r>
     </w:p>
     <w:p>
@@ -789,11 +797,13 @@
       </w:r>
     </w:p>
     <w:p>
-      <w:pPr>
-        <w:pStyle w:val="Heading3"/>
-      </w:pPr>
       <w:r>
-        <w:t>與影片對照</w:t>
+        <w:rPr>
+          <w:rFonts w:ascii="Microsoft JhengHei" w:hAnsi="Microsoft JhengHei" w:eastAsia="Microsoft JhengHei"/>
+          <w:b/>
+          <w:sz w:val="21"/>
+        </w:rPr>
+        <w:t>Claude 的對照分析</w:t>
       </w:r>
     </w:p>
     <w:p>
@@ -805,7 +815,21 @@
           <w:rFonts w:ascii="Microsoft JhengHei" w:hAnsi="Microsoft JhengHei" w:eastAsia="Microsoft JhengHei"/>
           <w:sz w:val="21"/>
         </w:rPr>
-        <w:t>畫面（約 00:14）只顯示前兩行：「永遠不要自己執行任務，一律交給 Sub agent 處理」與「不要所有任務都使用 Fable，簡單…」，與補充內容一致，其餘為補充。</w:t>
+        <w:t>與影片一致：</w:t>
+      </w:r>
+      <w:r>
+        <w:rPr>
+          <w:rFonts w:ascii="Consolas" w:hAnsi="Consolas" w:eastAsia="Microsoft JhengHei"/>
+          <w:sz w:val="19"/>
+        </w:rPr>
+        <w:t>frame_0007.jpg</w:t>
+      </w:r>
+      <w:r>
+        <w:rPr>
+          <w:rFonts w:ascii="Microsoft JhengHei" w:hAnsi="Microsoft JhengHei" w:eastAsia="Microsoft JhengHei"/>
+          <w:sz w:val="21"/>
+        </w:rPr>
+        <w:t>（00:14）畫面兩行與原文第 1–2 句意思相同、用字略異（畫面為「Sub agent」，原文為「sub-agent」；第二行只打到「簡單」，游標停在該處）；講者口述「複雜的任務才交給最強的模型、簡單的工作用 Opus 5.5、可拆分的任務交給 Sub Agent」與原文方向一致。</w:t>
       </w:r>
     </w:p>
     <w:p>
@@ -817,34 +841,7 @@
           <w:rFonts w:ascii="Microsoft JhengHei" w:hAnsi="Microsoft JhengHei" w:eastAsia="Microsoft JhengHei"/>
           <w:sz w:val="21"/>
         </w:rPr>
-        <w:t xml:space="preserve">講者口述的「最強的模型」＝ </w:t>
-      </w:r>
-      <w:r>
-        <w:rPr>
-          <w:rFonts w:ascii="Microsoft JhengHei" w:hAnsi="Microsoft JhengHei" w:eastAsia="Microsoft JhengHei"/>
-          <w:b/>
-          <w:sz w:val="21"/>
-        </w:rPr>
-        <w:t>Fable</w:t>
-      </w:r>
-      <w:r>
-        <w:rPr>
-          <w:rFonts w:ascii="Microsoft JhengHei" w:hAnsi="Microsoft JhengHei" w:eastAsia="Microsoft JhengHei"/>
-          <w:sz w:val="21"/>
-        </w:rPr>
-        <w:t>（補充內容的模型路由寫明 Fable 5.1 負責系統架構、困難 Bug、程式碼審查）；「比較簡單的工作」＝ Opus 5.5（修改、測試、文件、重構），資料查詢與摘要則用 Haiku 4.5。</w:t>
-      </w:r>
-    </w:p>
-    <w:p>
-      <w:pPr>
-        <w:pStyle w:val="ListBullet"/>
-      </w:pPr>
-      <w:r>
-        <w:rPr>
-          <w:rFonts w:ascii="Microsoft JhengHei" w:hAnsi="Microsoft JhengHei" w:eastAsia="Microsoft JhengHei"/>
-          <w:sz w:val="21"/>
-        </w:rPr>
-        <w:t xml:space="preserve">補充內容比口述多出三個做法：每次呼叫 Agent 都必須指定 </w:t>
+        <w:t xml:space="preserve">補充直接寫明（影片沒有的）：每次呼叫 Agent 都必須指定 </w:t>
       </w:r>
       <w:r>
         <w:rPr>
@@ -858,14 +855,28 @@
           <w:rFonts w:ascii="Microsoft JhengHei" w:hAnsi="Microsoft JhengHei" w:eastAsia="Microsoft JhengHei"/>
           <w:sz w:val="21"/>
         </w:rPr>
-        <w:t>、彼此獨立的任務平行執行、只讀 sub-agent 的報告而不直接讀檔。</w:t>
+        <w:t>；彼此獨立的 sub-agent 任務平行執行；只讀 sub-agent 的報告、不直接讀檔；以及 Haiku 4.5 負責資料查詢與摘要的分工。</w:t>
       </w:r>
     </w:p>
     <w:p>
       <w:pPr>
-        <w:pStyle w:val="Heading3"/>
+        <w:pStyle w:val="ListBullet"/>
       </w:pPr>
       <w:r>
+        <w:rPr>
+          <w:rFonts w:ascii="Microsoft JhengHei" w:hAnsi="Microsoft JhengHei" w:eastAsia="Microsoft JhengHei"/>
+          <w:sz w:val="21"/>
+        </w:rPr>
+        <w:t>據此推定（非補充直接寫明）：講者口述的「最強的模型」未點名，但原文寫明 Fable 5.1 負責系統架構、困難的 Bug、程式碼審查，且畫面出現「不要所有任務都使用 Fable」，因此推定指 Fable 5.1。講者口述的「簡單的工作」對應原文中 Opus 5.5 的範圍（修改、測試、文件、重構）。</w:t>
+      </w:r>
+    </w:p>
+    <w:p>
+      <w:r>
+        <w:rPr>
+          <w:rFonts w:ascii="Microsoft JhengHei" w:hAnsi="Microsoft JhengHei" w:eastAsia="Microsoft JhengHei"/>
+          <w:b/>
+          <w:sz w:val="21"/>
+        </w:rPr>
         <w:t>備註</w:t>
       </w:r>
     </w:p>
@@ -878,22 +889,33 @@
           <w:rFonts w:ascii="Microsoft JhengHei" w:hAnsi="Microsoft JhengHei" w:eastAsia="Microsoft JhengHei"/>
           <w:sz w:val="21"/>
         </w:rPr>
-        <w:t>以上文字為貼文所述，逐字保留；模型分工與其省成本效果是講者的範例與主張，</w:t>
+        <w:t>以上為貼文所述，逐字保留；原文含 Markdown 標記（</w:t>
       </w:r>
       <w:r>
         <w:rPr>
-          <w:rFonts w:ascii="Microsoft JhengHei" w:hAnsi="Microsoft JhengHei" w:eastAsia="Microsoft JhengHei"/>
-          <w:b/>
-          <w:sz w:val="21"/>
+          <w:rFonts w:ascii="Consolas" w:hAnsi="Consolas" w:eastAsia="Microsoft JhengHei"/>
+          <w:sz w:val="19"/>
         </w:rPr>
-        <w:t>未經查證</w:t>
+        <w:t>**</w:t>
       </w:r>
       <w:r>
         <w:rPr>
           <w:rFonts w:ascii="Microsoft JhengHei" w:hAnsi="Microsoft JhengHei" w:eastAsia="Microsoft JhengHei"/>
           <w:sz w:val="21"/>
         </w:rPr>
-        <w:t>，是否適用請依自己的專案評估。</w:t>
+        <w:t>、反引號），在 Word 版會原樣顯示。</w:t>
+      </w:r>
+    </w:p>
+    <w:p>
+      <w:pPr>
+        <w:pStyle w:val="ListBullet"/>
+      </w:pPr>
+      <w:r>
+        <w:rPr>
+          <w:rFonts w:ascii="Microsoft JhengHei" w:hAnsi="Microsoft JhengHei" w:eastAsia="Microsoft JhengHei"/>
+          <w:sz w:val="21"/>
+        </w:rPr>
+        <w:t>模型名稱與版本（Fable 5.1、Opus 5.5、Haiku 4.5）取自貼文，未經查證；模型分工能省多少額度是講者的主張，同樣未查證，是否適用請依自己的專案評估。</w:t>
       </w:r>
     </w:p>
     <w:p>
@@ -1145,7 +1167,7 @@
           <w:rFonts w:ascii="Microsoft JhengHei" w:hAnsi="Microsoft JhengHei" w:eastAsia="Microsoft JhengHei"/>
           <w:sz w:val="21"/>
         </w:rPr>
-        <w:t xml:space="preserve"> 複雜任務才交給最強模型（Fable）、簡單工作用 Opus 5.5；適合拆開的任務交給不同 Sub Agent。畫面只露出 CLAUDE.md 前兩行，完整內容見〈補充資料〉。</w:t>
+        <w:t xml:space="preserve"> 複雜任務才交給最強模型（據補充資料推定為 Fable）、簡單工作用 Opus 5.5；適合拆開的任務交給不同 Sub Agent。畫面只露出 CLAUDE.md 前兩行，完整內容見〈補充資料〉。</w:t>
       </w:r>
     </w:p>
     <w:p>
@@ -1614,7 +1636,7 @@
                 <w:rFonts w:ascii="Microsoft JhengHei" w:hAnsi="Microsoft JhengHei" w:eastAsia="Microsoft JhengHei"/>
                 <w:sz w:val="19"/>
               </w:rPr>
-              <w:t>講者未點名；已由 supplement.md 確認指 Fable（Fable 5.1）</w:t>
+              <w:t>講者未點名；據 supplement.md S1 推定指 Fable（Fable 5.1），非補充直接寫明</w:t>
             </w:r>
           </w:p>
         </w:tc>

</xml_diff>